<commit_message>
Refresh Bible resource data for 2026-09-28 release
</commit_message>
<xml_diff>
--- a/eng/docx/03.content.docx
+++ b/eng/docx/03.content.docx
@@ -5371,21 +5371,21 @@
           <w:b/>
           <w:lang w:val="en_US" w:bidi="en_US"/>
         </w:rPr>
-        <w:t>Why was Moses angry with Eleazer and Ithamar, the remaining sons of Aaron?</w:t>
-      </w:r>
-    </w:p>
-    <w:p>
-      <w:pPr/>
-      <w:r>
-        <w:rPr>
-          <w:lang w:val="en_US" w:bidi="en_US"/>
-        </w:rPr>
-      </w:r>
-      <w:r>
-        <w:rPr>
-          <w:lang w:val="en_US" w:bidi="en_US"/>
-        </w:rPr>
-        <w:t>Moses was angry with Eleazer and Ithamar because they had let the goat for the sin offering burn up instead of eating it.</w:t>
+        <w:t>Why was Moses angry with Eleazar and Ithamar, the remaining sons of Aaron?</w:t>
+      </w:r>
+    </w:p>
+    <w:p>
+      <w:pPr/>
+      <w:r>
+        <w:rPr>
+          <w:lang w:val="en_US" w:bidi="en_US"/>
+        </w:rPr>
+      </w:r>
+      <w:r>
+        <w:rPr>
+          <w:lang w:val="en_US" w:bidi="en_US"/>
+        </w:rPr>
+        <w:t>Moses was angry with Eleazar and Ithamar because they had let the goat for the sin offering burn up instead of eating it.</w:t>
       </w:r>
       <w:r>
         <w:rPr>

</xml_diff>